<commit_message>
Add Chapter 10: Impact Analysis - UN Sustainable Development Goals (SDG 9 & 12)
</commit_message>
<xml_diff>
--- a/Final-Report-102206005.docx
+++ b/Final-Report-102206005.docx
@@ -166,7 +166,7 @@
           <w:b/>
           <w:bCs/>
         </w:rPr>
-        <w:t xml:space="preserve">Reyansh</w:t>
+        <w:t xml:space="preserve">Reyansh Gahlot</w:t>
       </w:r>
     </w:p>
     <w:p>
@@ -365,7 +365,7 @@
           <w:sz w:val="24"/>
           <w:szCs w:val="24"/>
         </w:rPr>
-        <w:t xml:space="preserve">This is to certify that the Final Internship Report entitled "SoC Verification and Automation at Arm Ltd." submitted by Reyansh (Roll No. 102206005) of B.E. Electronics &amp; Communication Engineering, Thapar Institute of Engineering &amp; Technology, Patiala, is an authentic record of work carried out during the internship period from January 2026 to June 2026 at Arm Ltd., Bangalore, under the guidance of the undersigned.</w:t>
+        <w:t xml:space="preserve">This is to certify that the Final Internship Report entitled "SoC Verification and Automation at Arm Ltd." submitted by Reyansh Gahlot (Roll No. 102206005) of B.E. Electronics &amp; Communication Engineering, Thapar Institute of Engineering &amp; Technology, Patiala, is an authentic record of work carried out during the internship period from January 2026 to June 2026 at Arm Ltd., Bangalore, under the guidance of the undersigned.</w:t>
       </w:r>
     </w:p>
     <w:p>
@@ -493,7 +493,7 @@
                 <w:szCs w:val="22"/>
                 <w:color w:val="000000"/>
               </w:rPr>
-              <w:t xml:space="preserve">Dr. [Faculty Name]</w:t>
+              <w:t xml:space="preserve">Dr. Amit Mishra</w:t>
             </w:r>
           </w:p>
         </w:tc>
@@ -514,7 +514,7 @@
                 <w:szCs w:val="22"/>
                 <w:color w:val="000000"/>
               </w:rPr>
-              <w:t xml:space="preserve">Mr./Ms. [Industry Mentor Name]</w:t>
+              <w:t xml:space="preserve">Vinod</w:t>
             </w:r>
           </w:p>
         </w:tc>
@@ -997,7 +997,7 @@
           <w:b/>
           <w:bCs/>
         </w:rPr>
-        <w:t xml:space="preserve">Reyansh</w:t>
+        <w:t xml:space="preserve">Reyansh Gahlot</w:t>
       </w:r>
     </w:p>
     <w:p>
@@ -1947,7 +1947,77 @@
           <w:sz w:val="24"/>
           <w:szCs w:val="24"/>
         </w:rPr>
-        <w:t xml:space="preserve">References ................................................ 41</w:t>
+        <w:t xml:space="preserve">Chapter 10: Impact Analysis - SDGs ........................ 41</w:t>
+      </w:r>
+    </w:p>
+    <w:p>
+      <w:pPr>
+        <w:jc w:val="left"/>
+        <w:spacing w:before="0" w:after="40" w:line="360" w:lineRule="auto"/>
+      </w:pPr>
+      <w:r>
+        <w:rPr>
+          <w:rFonts w:ascii="Times New Roman" w:hAnsi="Times New Roman" w:cs="Times New Roman"/>
+          <w:sz w:val="24"/>
+          <w:szCs w:val="24"/>
+        </w:rPr>
+        <w:t xml:space="preserve">   10.1 Alignment with UN SDGs ............................ 41</w:t>
+      </w:r>
+    </w:p>
+    <w:p>
+      <w:pPr>
+        <w:jc w:val="left"/>
+        <w:spacing w:before="0" w:after="40" w:line="360" w:lineRule="auto"/>
+      </w:pPr>
+      <w:r>
+        <w:rPr>
+          <w:rFonts w:ascii="Times New Roman" w:hAnsi="Times New Roman" w:cs="Times New Roman"/>
+          <w:sz w:val="24"/>
+          <w:szCs w:val="24"/>
+        </w:rPr>
+        <w:t xml:space="preserve">   10.2 SDG 9: Industry, Innovation ....................... 42</w:t>
+      </w:r>
+    </w:p>
+    <w:p>
+      <w:pPr>
+        <w:jc w:val="left"/>
+        <w:spacing w:before="0" w:after="40" w:line="360" w:lineRule="auto"/>
+      </w:pPr>
+      <w:r>
+        <w:rPr>
+          <w:rFonts w:ascii="Times New Roman" w:hAnsi="Times New Roman" w:cs="Times New Roman"/>
+          <w:sz w:val="24"/>
+          <w:szCs w:val="24"/>
+        </w:rPr>
+        <w:t xml:space="preserve">   10.3 SDG 12: Responsible Production .................... 43</w:t>
+      </w:r>
+    </w:p>
+    <w:p>
+      <w:pPr>
+        <w:jc w:val="left"/>
+        <w:spacing w:before="0" w:after="40" w:line="360" w:lineRule="auto"/>
+      </w:pPr>
+      <w:r>
+        <w:rPr>
+          <w:rFonts w:ascii="Times New Roman" w:hAnsi="Times New Roman" w:cs="Times New Roman"/>
+          <w:sz w:val="24"/>
+          <w:szCs w:val="24"/>
+        </w:rPr>
+        <w:t xml:space="preserve">   10.4 Quantitative Impact ............................... 44</w:t>
+      </w:r>
+    </w:p>
+    <w:p>
+      <w:pPr>
+        <w:jc w:val="left"/>
+        <w:spacing w:before="0" w:after="40" w:line="360" w:lineRule="auto"/>
+      </w:pPr>
+      <w:r>
+        <w:rPr>
+          <w:rFonts w:ascii="Times New Roman" w:hAnsi="Times New Roman" w:cs="Times New Roman"/>
+          <w:sz w:val="24"/>
+          <w:szCs w:val="24"/>
+        </w:rPr>
+        <w:t xml:space="preserve">References ................................................ 45</w:t>
       </w:r>
     </w:p>
     <w:p>
@@ -20034,6 +20104,1439 @@
           <w:szCs w:val="24"/>
         </w:rPr>
         <w:t xml:space="preserve">As AI capabilities continue to improve, the boundary between what requires human engineering judgement and what can be automated will continue to shift, requiring ongoing adaptation of verification workflows</w:t>
+      </w:r>
+    </w:p>
+    <w:p>
+      <w:r>
+        <w:br w:type="page"/>
+      </w:r>
+    </w:p>
+    <w:p>
+      <w:pPr>
+        <w:pStyle w:val="Heading1"/>
+        <w:jc w:val="left"/>
+        <w:spacing w:before="240" w:after="120" w:line="360" w:lineRule="auto"/>
+      </w:pPr>
+      <w:r>
+        <w:rPr>
+          <w:rFonts w:ascii="Calibri" w:hAnsi="Calibri" w:cs="Calibri"/>
+          <w:sz w:val="32"/>
+          <w:szCs w:val="32"/>
+          <w:b/>
+          <w:bCs/>
+          <w:color w:val="1F4E79"/>
+        </w:rPr>
+        <w:t xml:space="preserve">Chapter 10: Impact Analysis - Sustainable Development Goals</w:t>
+      </w:r>
+    </w:p>
+    <w:p>
+      <w:pPr>
+        <w:spacing w:before="0" w:after="0" w:line="360" w:lineRule="auto"/>
+      </w:pPr>
+    </w:p>
+    <w:p>
+      <w:pPr>
+        <w:pStyle w:val="Heading2"/>
+        <w:jc w:val="left"/>
+        <w:spacing w:before="240" w:after="120" w:line="360" w:lineRule="auto"/>
+      </w:pPr>
+      <w:r>
+        <w:rPr>
+          <w:rFonts w:ascii="Calibri" w:hAnsi="Calibri" w:cs="Calibri"/>
+          <w:sz w:val="28"/>
+          <w:szCs w:val="28"/>
+          <w:b/>
+          <w:bCs/>
+          <w:color w:val="1F4E79"/>
+        </w:rPr>
+        <w:t xml:space="preserve">10.1 Alignment with UN Sustainable Development Goals</w:t>
+      </w:r>
+    </w:p>
+    <w:p>
+      <w:pPr>
+        <w:jc w:val="both"/>
+        <w:spacing w:before="0" w:after="120" w:line="360" w:lineRule="auto"/>
+      </w:pPr>
+      <w:r>
+        <w:rPr>
+          <w:rFonts w:ascii="Times New Roman" w:hAnsi="Times New Roman" w:cs="Times New Roman"/>
+          <w:sz w:val="24"/>
+          <w:szCs w:val="24"/>
+        </w:rPr>
+        <w:t xml:space="preserve">The United Nations Sustainable Development Goals (SDGs) provide a universal framework for assessing the broader societal impact of engineering work. This internship's contributions to SoC verification and automation align primarily with SDG 9: Industry, Innovation and Infrastructure, while also supporting SDG 12: Responsible Consumption and Production through waste reduction in semiconductor manufacturing.</w:t>
+      </w:r>
+    </w:p>
+    <w:p>
+      <w:pPr>
+        <w:spacing w:before="0" w:after="0" w:line="360" w:lineRule="auto"/>
+      </w:pPr>
+    </w:p>
+    <w:p>
+      <w:pPr>
+        <w:pStyle w:val="Heading2"/>
+        <w:jc w:val="left"/>
+        <w:spacing w:before="240" w:after="120" w:line="360" w:lineRule="auto"/>
+      </w:pPr>
+      <w:r>
+        <w:rPr>
+          <w:rFonts w:ascii="Calibri" w:hAnsi="Calibri" w:cs="Calibri"/>
+          <w:sz w:val="28"/>
+          <w:szCs w:val="28"/>
+          <w:b/>
+          <w:bCs/>
+          <w:color w:val="1F4E79"/>
+        </w:rPr>
+        <w:t xml:space="preserve">10.2 SDG 9: Industry, Innovation and Infrastructure</w:t>
+      </w:r>
+    </w:p>
+    <w:p>
+      <w:pPr>
+        <w:jc w:val="both"/>
+        <w:spacing w:before="0" w:after="120" w:line="360" w:lineRule="auto"/>
+      </w:pPr>
+      <w:r>
+        <w:rPr>
+          <w:rFonts w:ascii="Times New Roman" w:hAnsi="Times New Roman" w:cs="Times New Roman"/>
+          <w:sz w:val="24"/>
+          <w:szCs w:val="24"/>
+        </w:rPr>
+        <w:t xml:space="preserve">SDG 9 calls for building resilient infrastructure, promoting inclusive and sustainable industrialisation, and fostering innovation. The work performed during this internship contributes to this goal in the following ways:</w:t>
+      </w:r>
+    </w:p>
+    <w:p>
+      <w:pPr>
+        <w:spacing w:before="0" w:after="0" w:line="360" w:lineRule="auto"/>
+      </w:pPr>
+    </w:p>
+    <w:p>
+      <w:pPr>
+        <w:jc w:val="both"/>
+        <w:spacing w:before="0" w:after="120" w:line="360" w:lineRule="auto"/>
+      </w:pPr>
+      <w:r>
+        <w:rPr>
+          <w:rFonts w:ascii="Times New Roman" w:hAnsi="Times New Roman" w:cs="Times New Roman"/>
+          <w:sz w:val="24"/>
+          <w:szCs w:val="24"/>
+          <w:b/>
+          <w:bCs/>
+        </w:rPr>
+        <w:t xml:space="preserve">Resilient Digital Infrastructure Starts with Verified Silicon:</w:t>
+      </w:r>
+    </w:p>
+    <w:p>
+      <w:pPr>
+        <w:spacing w:before="0" w:after="0" w:line="360" w:lineRule="auto"/>
+      </w:pPr>
+    </w:p>
+    <w:p>
+      <w:pPr>
+        <w:jc w:val="both"/>
+        <w:spacing w:before="0" w:after="120" w:line="360" w:lineRule="auto"/>
+      </w:pPr>
+      <w:r>
+        <w:rPr>
+          <w:rFonts w:ascii="Times New Roman" w:hAnsi="Times New Roman" w:cs="Times New Roman"/>
+          <w:sz w:val="24"/>
+          <w:szCs w:val="24"/>
+        </w:rPr>
+        <w:t xml:space="preserve">SDG 9 targets resilient infrastructure, including digital infrastructure. Modern infrastructure -- power grids, hospitals, mobile networks, financial systems, autonomous vehicles, and data centres -- fundamentally runs on processors. Arm processors power over 99% of smartphones, the majority of IoT devices, and an increasing share of cloud servers. A single uncaught verification bug can ripple into safety recalls, data loss, or wasted manufacturing resources.</w:t>
+      </w:r>
+    </w:p>
+    <w:p>
+      <w:pPr>
+        <w:spacing w:before="0" w:after="0" w:line="360" w:lineRule="auto"/>
+      </w:pPr>
+    </w:p>
+    <w:p>
+      <w:pPr>
+        <w:jc w:val="both"/>
+        <w:spacing w:before="0" w:after="120" w:line="360" w:lineRule="auto"/>
+      </w:pPr>
+      <w:r>
+        <w:rPr>
+          <w:rFonts w:ascii="Times New Roman" w:hAnsi="Times New Roman" w:cs="Times New Roman"/>
+          <w:sz w:val="24"/>
+          <w:szCs w:val="24"/>
+        </w:rPr>
+        <w:t xml:space="preserve">The verification work performed during this internship directly ensures the reliability and correctness of silicon that underpins global digital infrastructure. Specifically:</w:t>
+      </w:r>
+    </w:p>
+    <w:p>
+      <w:pPr>
+        <w:spacing w:before="0" w:after="0" w:line="360" w:lineRule="auto"/>
+      </w:pPr>
+    </w:p>
+    <w:p>
+      <w:pPr>
+        <w:numPr>
+          <w:ilvl w:val="0"/>
+          <w:numId w:val="1"/>
+        </w:numPr>
+        <w:jc w:val="left"/>
+        <w:spacing w:before="0" w:after="120" w:line="360" w:lineRule="auto"/>
+        <w:ind w:left="720"/>
+      </w:pPr>
+      <w:r>
+        <w:rPr>
+          <w:rFonts w:ascii="Times New Roman" w:hAnsi="Times New Roman" w:cs="Times New Roman"/>
+          <w:sz w:val="24"/>
+          <w:szCs w:val="24"/>
+        </w:rPr>
+        <w:t xml:space="preserve">The Status Register Checker provides continuous automated monitoring of hardware correctness, catching bugs before they reach production silicon that powers critical infrastructure</w:t>
+      </w:r>
+    </w:p>
+    <w:p>
+      <w:pPr>
+        <w:numPr>
+          <w:ilvl w:val="0"/>
+          <w:numId w:val="1"/>
+        </w:numPr>
+        <w:jc w:val="left"/>
+        <w:spacing w:before="0" w:after="120" w:line="360" w:lineRule="auto"/>
+        <w:ind w:left="720"/>
+      </w:pPr>
+      <w:r>
+        <w:rPr>
+          <w:rFonts w:ascii="Times New Roman" w:hAnsi="Times New Roman" w:cs="Times New Roman"/>
+          <w:sz w:val="24"/>
+          <w:szCs w:val="24"/>
+        </w:rPr>
+        <w:t xml:space="preserve">The CMN Clock Controller verification ensures reliable power management in multi-core processors used in data centres and communication infrastructure</w:t>
+      </w:r>
+    </w:p>
+    <w:p>
+      <w:pPr>
+        <w:numPr>
+          <w:ilvl w:val="0"/>
+          <w:numId w:val="1"/>
+        </w:numPr>
+        <w:jc w:val="left"/>
+        <w:spacing w:before="0" w:after="120" w:line="360" w:lineRule="auto"/>
+        <w:ind w:left="720"/>
+      </w:pPr>
+      <w:r>
+        <w:rPr>
+          <w:rFonts w:ascii="Times New Roman" w:hAnsi="Times New Roman" w:cs="Times New Roman"/>
+          <w:sz w:val="24"/>
+          <w:szCs w:val="24"/>
+        </w:rPr>
+        <w:t xml:space="preserve">The compile warning resolution improves code quality and long-term maintainability of verification infrastructure</w:t>
+      </w:r>
+    </w:p>
+    <w:p>
+      <w:pPr>
+        <w:spacing w:before="0" w:after="0" w:line="360" w:lineRule="auto"/>
+      </w:pPr>
+    </w:p>
+    <w:p>
+      <w:pPr>
+        <w:jc w:val="both"/>
+        <w:spacing w:before="0" w:after="120" w:line="360" w:lineRule="auto"/>
+      </w:pPr>
+      <w:r>
+        <w:rPr>
+          <w:rFonts w:ascii="Times New Roman" w:hAnsi="Times New Roman" w:cs="Times New Roman"/>
+          <w:sz w:val="24"/>
+          <w:szCs w:val="24"/>
+          <w:b/>
+          <w:bCs/>
+        </w:rPr>
+        <w:t xml:space="preserve">Fostering Innovation through AI-Assisted Engineering:</w:t>
+      </w:r>
+    </w:p>
+    <w:p>
+      <w:pPr>
+        <w:spacing w:before="0" w:after="0" w:line="360" w:lineRule="auto"/>
+      </w:pPr>
+    </w:p>
+    <w:p>
+      <w:pPr>
+        <w:jc w:val="both"/>
+        <w:spacing w:before="0" w:after="120" w:line="360" w:lineRule="auto"/>
+      </w:pPr>
+      <w:r>
+        <w:rPr>
+          <w:rFonts w:ascii="Times New Roman" w:hAnsi="Times New Roman" w:cs="Times New Roman"/>
+          <w:sz w:val="24"/>
+          <w:szCs w:val="24"/>
+        </w:rPr>
+        <w:t xml:space="preserve">The AI Agent for hardware programming code generation represents a novel application of large language models to semiconductor development workflows. This innovation:</w:t>
+      </w:r>
+    </w:p>
+    <w:p>
+      <w:pPr>
+        <w:numPr>
+          <w:ilvl w:val="0"/>
+          <w:numId w:val="1"/>
+        </w:numPr>
+        <w:jc w:val="left"/>
+        <w:spacing w:before="0" w:after="120" w:line="360" w:lineRule="auto"/>
+        <w:ind w:left="720"/>
+      </w:pPr>
+      <w:r>
+        <w:rPr>
+          <w:rFonts w:ascii="Times New Roman" w:hAnsi="Times New Roman" w:cs="Times New Roman"/>
+          <w:sz w:val="24"/>
+          <w:szCs w:val="24"/>
+        </w:rPr>
+        <w:t xml:space="preserve">Demonstrates how AI can augment (not replace) engineering expertise, enabling engineers to focus on creative problem-solving rather than repetitive coding tasks</w:t>
+      </w:r>
+    </w:p>
+    <w:p>
+      <w:pPr>
+        <w:numPr>
+          <w:ilvl w:val="0"/>
+          <w:numId w:val="1"/>
+        </w:numPr>
+        <w:jc w:val="left"/>
+        <w:spacing w:before="0" w:after="120" w:line="360" w:lineRule="auto"/>
+        <w:ind w:left="720"/>
+      </w:pPr>
+      <w:r>
+        <w:rPr>
+          <w:rFonts w:ascii="Times New Roman" w:hAnsi="Times New Roman" w:cs="Times New Roman"/>
+          <w:sz w:val="24"/>
+          <w:szCs w:val="24"/>
+        </w:rPr>
+        <w:t xml:space="preserve">Reduces time-to-market for new processor designs, accelerating the availability of improved computing infrastructure worldwide</w:t>
+      </w:r>
+    </w:p>
+    <w:p>
+      <w:pPr>
+        <w:numPr>
+          <w:ilvl w:val="0"/>
+          <w:numId w:val="1"/>
+        </w:numPr>
+        <w:jc w:val="left"/>
+        <w:spacing w:before="0" w:after="120" w:line="360" w:lineRule="auto"/>
+        <w:ind w:left="720"/>
+      </w:pPr>
+      <w:r>
+        <w:rPr>
+          <w:rFonts w:ascii="Times New Roman" w:hAnsi="Times New Roman" w:cs="Times New Roman"/>
+          <w:sz w:val="24"/>
+          <w:szCs w:val="24"/>
+        </w:rPr>
+        <w:t xml:space="preserve">Creates a reusable methodology that can be applied across the semiconductor industry, potentially benefiting all organisations developing hardware</w:t>
+      </w:r>
+    </w:p>
+    <w:p>
+      <w:pPr>
+        <w:spacing w:before="0" w:after="0" w:line="360" w:lineRule="auto"/>
+      </w:pPr>
+    </w:p>
+    <w:p>
+      <w:pPr>
+        <w:pStyle w:val="Heading2"/>
+        <w:jc w:val="left"/>
+        <w:spacing w:before="240" w:after="120" w:line="360" w:lineRule="auto"/>
+      </w:pPr>
+      <w:r>
+        <w:rPr>
+          <w:rFonts w:ascii="Calibri" w:hAnsi="Calibri" w:cs="Calibri"/>
+          <w:sz w:val="28"/>
+          <w:szCs w:val="28"/>
+          <w:b/>
+          <w:bCs/>
+          <w:color w:val="1F4E79"/>
+        </w:rPr>
+        <w:t xml:space="preserve">10.3 SDG 12: Responsible Consumption and Production</w:t>
+      </w:r>
+    </w:p>
+    <w:p>
+      <w:pPr>
+        <w:jc w:val="both"/>
+        <w:spacing w:before="0" w:after="120" w:line="360" w:lineRule="auto"/>
+      </w:pPr>
+      <w:r>
+        <w:rPr>
+          <w:rFonts w:ascii="Times New Roman" w:hAnsi="Times New Roman" w:cs="Times New Roman"/>
+          <w:sz w:val="24"/>
+          <w:szCs w:val="24"/>
+        </w:rPr>
+        <w:t xml:space="preserve">SDG 12 focuses on sustainable consumption and production patterns, including reducing waste and improving resource efficiency. The semiconductor industry has significant environmental impact through fabrication processes, rare-earth material consumption, and energy usage. This internship contributes to SDG 12 through:</w:t>
+      </w:r>
+    </w:p>
+    <w:p>
+      <w:pPr>
+        <w:spacing w:before="0" w:after="0" w:line="360" w:lineRule="auto"/>
+      </w:pPr>
+    </w:p>
+    <w:p>
+      <w:pPr>
+        <w:jc w:val="both"/>
+        <w:spacing w:before="0" w:after="120" w:line="360" w:lineRule="auto"/>
+      </w:pPr>
+      <w:r>
+        <w:rPr>
+          <w:rFonts w:ascii="Times New Roman" w:hAnsi="Times New Roman" w:cs="Times New Roman"/>
+          <w:sz w:val="24"/>
+          <w:szCs w:val="24"/>
+          <w:b/>
+          <w:bCs/>
+        </w:rPr>
+        <w:t xml:space="preserve">Reducing Silicon Re-spins:</w:t>
+      </w:r>
+    </w:p>
+    <w:p>
+      <w:pPr>
+        <w:numPr>
+          <w:ilvl w:val="0"/>
+          <w:numId w:val="1"/>
+        </w:numPr>
+        <w:jc w:val="left"/>
+        <w:spacing w:before="0" w:after="120" w:line="360" w:lineRule="auto"/>
+        <w:ind w:left="720"/>
+      </w:pPr>
+      <w:r>
+        <w:rPr>
+          <w:rFonts w:ascii="Times New Roman" w:hAnsi="Times New Roman" w:cs="Times New Roman"/>
+          <w:sz w:val="24"/>
+          <w:szCs w:val="24"/>
+        </w:rPr>
+        <w:t xml:space="preserve">Each silicon re-spin (a chip redesign due to a post-fabrication bug discovery) wastes millions of dollars worth of silicon wafers, rare-earth materials, chemical reagents, ultra-pure water, and energy</w:t>
+      </w:r>
+    </w:p>
+    <w:p>
+      <w:pPr>
+        <w:numPr>
+          <w:ilvl w:val="0"/>
+          <w:numId w:val="1"/>
+        </w:numPr>
+        <w:jc w:val="left"/>
+        <w:spacing w:before="0" w:after="120" w:line="360" w:lineRule="auto"/>
+        <w:ind w:left="720"/>
+      </w:pPr>
+      <w:r>
+        <w:rPr>
+          <w:rFonts w:ascii="Times New Roman" w:hAnsi="Times New Roman" w:cs="Times New Roman"/>
+          <w:sz w:val="24"/>
+          <w:szCs w:val="24"/>
+        </w:rPr>
+        <w:t xml:space="preserve">The three RTL bugs found during this internship (one in the debug subsystem, two in the clock controller) would have required post-silicon debugging and potentially a re-spin if they reached fabrication</w:t>
+      </w:r>
+    </w:p>
+    <w:p>
+      <w:pPr>
+        <w:numPr>
+          <w:ilvl w:val="0"/>
+          <w:numId w:val="1"/>
+        </w:numPr>
+        <w:jc w:val="left"/>
+        <w:spacing w:before="0" w:after="120" w:line="360" w:lineRule="auto"/>
+        <w:ind w:left="720"/>
+      </w:pPr>
+      <w:r>
+        <w:rPr>
+          <w:rFonts w:ascii="Times New Roman" w:hAnsi="Times New Roman" w:cs="Times New Roman"/>
+          <w:sz w:val="24"/>
+          <w:szCs w:val="24"/>
+        </w:rPr>
+        <w:t xml:space="preserve">Bug-free silicon costs grow exponentially with each stage: fixing a bug in simulation costs approximately $1, in fabrication $1 million, and after deployment potentially $1 billion</w:t>
+      </w:r>
+    </w:p>
+    <w:p>
+      <w:pPr>
+        <w:numPr>
+          <w:ilvl w:val="0"/>
+          <w:numId w:val="1"/>
+        </w:numPr>
+        <w:jc w:val="left"/>
+        <w:spacing w:before="0" w:after="120" w:line="360" w:lineRule="auto"/>
+        <w:ind w:left="720"/>
+      </w:pPr>
+      <w:r>
+        <w:rPr>
+          <w:rFonts w:ascii="Times New Roman" w:hAnsi="Times New Roman" w:cs="Times New Roman"/>
+          <w:sz w:val="24"/>
+          <w:szCs w:val="24"/>
+        </w:rPr>
+        <w:t xml:space="preserve">By catching bugs early in the verification phase, this work directly prevents wasteful consumption of fabrication resources</w:t>
+      </w:r>
+    </w:p>
+    <w:p>
+      <w:pPr>
+        <w:spacing w:before="0" w:after="0" w:line="360" w:lineRule="auto"/>
+      </w:pPr>
+    </w:p>
+    <w:p>
+      <w:pPr>
+        <w:jc w:val="both"/>
+        <w:spacing w:before="0" w:after="120" w:line="360" w:lineRule="auto"/>
+      </w:pPr>
+      <w:r>
+        <w:rPr>
+          <w:rFonts w:ascii="Times New Roman" w:hAnsi="Times New Roman" w:cs="Times New Roman"/>
+          <w:sz w:val="24"/>
+          <w:szCs w:val="24"/>
+          <w:b/>
+          <w:bCs/>
+        </w:rPr>
+        <w:t xml:space="preserve">Enabling Energy-Efficient Operation:</w:t>
+      </w:r>
+    </w:p>
+    <w:p>
+      <w:pPr>
+        <w:numPr>
+          <w:ilvl w:val="0"/>
+          <w:numId w:val="1"/>
+        </w:numPr>
+        <w:jc w:val="left"/>
+        <w:spacing w:before="0" w:after="120" w:line="360" w:lineRule="auto"/>
+        <w:ind w:left="720"/>
+      </w:pPr>
+      <w:r>
+        <w:rPr>
+          <w:rFonts w:ascii="Times New Roman" w:hAnsi="Times New Roman" w:cs="Times New Roman"/>
+          <w:sz w:val="24"/>
+          <w:szCs w:val="24"/>
+        </w:rPr>
+        <w:t xml:space="preserve">The CMN Clock Controller enables dynamic clock gating, which directly reduces the operational power consumption of processors in deployment</w:t>
+      </w:r>
+    </w:p>
+    <w:p>
+      <w:pPr>
+        <w:numPr>
+          <w:ilvl w:val="0"/>
+          <w:numId w:val="1"/>
+        </w:numPr>
+        <w:jc w:val="left"/>
+        <w:spacing w:before="0" w:after="120" w:line="360" w:lineRule="auto"/>
+        <w:ind w:left="720"/>
+      </w:pPr>
+      <w:r>
+        <w:rPr>
+          <w:rFonts w:ascii="Times New Roman" w:hAnsi="Times New Roman" w:cs="Times New Roman"/>
+          <w:sz w:val="24"/>
+          <w:szCs w:val="24"/>
+        </w:rPr>
+        <w:t xml:space="preserve">Verified clock gating reduces data centre energy consumption -- a growing concern as AI workloads drive exponential growth in compute demand</w:t>
+      </w:r>
+    </w:p>
+    <w:p>
+      <w:pPr>
+        <w:numPr>
+          <w:ilvl w:val="0"/>
+          <w:numId w:val="1"/>
+        </w:numPr>
+        <w:jc w:val="left"/>
+        <w:spacing w:before="0" w:after="120" w:line="360" w:lineRule="auto"/>
+        <w:ind w:left="720"/>
+      </w:pPr>
+      <w:r>
+        <w:rPr>
+          <w:rFonts w:ascii="Times New Roman" w:hAnsi="Times New Roman" w:cs="Times New Roman"/>
+          <w:sz w:val="24"/>
+          <w:szCs w:val="24"/>
+        </w:rPr>
+        <w:t xml:space="preserve">Reliable power management extends battery life in mobile devices, reducing electronic waste from premature device replacement</w:t>
+      </w:r>
+    </w:p>
+    <w:p>
+      <w:pPr>
+        <w:spacing w:before="0" w:after="0" w:line="360" w:lineRule="auto"/>
+      </w:pPr>
+    </w:p>
+    <w:p>
+      <w:pPr>
+        <w:pStyle w:val="Heading2"/>
+        <w:jc w:val="left"/>
+        <w:spacing w:before="240" w:after="120" w:line="360" w:lineRule="auto"/>
+      </w:pPr>
+      <w:r>
+        <w:rPr>
+          <w:rFonts w:ascii="Calibri" w:hAnsi="Calibri" w:cs="Calibri"/>
+          <w:sz w:val="28"/>
+          <w:szCs w:val="28"/>
+          <w:b/>
+          <w:bCs/>
+          <w:color w:val="1F4E79"/>
+        </w:rPr>
+        <w:t xml:space="preserve">10.4 Quantitative Impact Assessment</w:t>
+      </w:r>
+    </w:p>
+    <w:p>
+      <w:pPr>
+        <w:spacing w:before="0" w:after="0" w:line="360" w:lineRule="auto"/>
+      </w:pPr>
+    </w:p>
+    <w:tbl>
+      <w:tblPr>
+        <w:tblW w:w="9000" w:type="dxa"/>
+        <w:jc w:val="center"/>
+        <w:tblBorders>
+          <w:top w:val="single" w:sz="4" w:space="0" w:color="D9D9D9"/>
+          <w:left w:val="single" w:sz="4" w:space="0" w:color="D9D9D9"/>
+          <w:bottom w:val="single" w:sz="4" w:space="0" w:color="D9D9D9"/>
+          <w:right w:val="single" w:sz="4" w:space="0" w:color="D9D9D9"/>
+          <w:insideH w:val="single" w:sz="4" w:space="0" w:color="D9D9D9"/>
+          <w:insideV w:val="single" w:sz="4" w:space="0" w:color="D9D9D9"/>
+        </w:tblBorders>
+        <w:tblLayout w:type="fixed"/>
+      </w:tblPr>
+      <w:tblGrid>
+        <w:gridCol w:w="3000"/>
+        <w:gridCol w:w="3000"/>
+        <w:gridCol w:w="3000"/>
+      </w:tblGrid>
+      <w:tr>
+        <w:tc>
+          <w:tcPr>
+            <w:tcW w:w="3000" w:type="dxa"/>
+            <w:shd w:val="clear" w:color="auto" w:fill="1F4E79"/>
+            <w:vAlign w:val="center"/>
+          </w:tcPr>
+          <w:p>
+            <w:pPr>
+              <w:jc w:val="center"/>
+              <w:spacing w:before="60" w:after="60" w:line="240" w:lineRule="auto"/>
+            </w:pPr>
+            <w:r>
+              <w:rPr>
+                <w:rFonts w:ascii="Times New Roman" w:hAnsi="Times New Roman" w:cs="Times New Roman"/>
+                <w:sz w:val="22"/>
+                <w:szCs w:val="22"/>
+                <w:b/>
+                <w:bCs/>
+                <w:color w:val="FFFFFF"/>
+              </w:rPr>
+              <w:t xml:space="preserve">Impact Dimension</w:t>
+            </w:r>
+          </w:p>
+        </w:tc>
+        <w:tc>
+          <w:tcPr>
+            <w:tcW w:w="3000" w:type="dxa"/>
+            <w:shd w:val="clear" w:color="auto" w:fill="1F4E79"/>
+            <w:vAlign w:val="center"/>
+          </w:tcPr>
+          <w:p>
+            <w:pPr>
+              <w:jc w:val="center"/>
+              <w:spacing w:before="60" w:after="60" w:line="240" w:lineRule="auto"/>
+            </w:pPr>
+            <w:r>
+              <w:rPr>
+                <w:rFonts w:ascii="Times New Roman" w:hAnsi="Times New Roman" w:cs="Times New Roman"/>
+                <w:sz w:val="22"/>
+                <w:szCs w:val="22"/>
+                <w:b/>
+                <w:bCs/>
+                <w:color w:val="FFFFFF"/>
+              </w:rPr>
+              <w:t xml:space="preserve">Metric</w:t>
+            </w:r>
+          </w:p>
+        </w:tc>
+        <w:tc>
+          <w:tcPr>
+            <w:tcW w:w="3000" w:type="dxa"/>
+            <w:shd w:val="clear" w:color="auto" w:fill="1F4E79"/>
+            <w:vAlign w:val="center"/>
+          </w:tcPr>
+          <w:p>
+            <w:pPr>
+              <w:jc w:val="center"/>
+              <w:spacing w:before="60" w:after="60" w:line="240" w:lineRule="auto"/>
+            </w:pPr>
+            <w:r>
+              <w:rPr>
+                <w:rFonts w:ascii="Times New Roman" w:hAnsi="Times New Roman" w:cs="Times New Roman"/>
+                <w:sz w:val="22"/>
+                <w:szCs w:val="22"/>
+                <w:b/>
+                <w:bCs/>
+                <w:color w:val="FFFFFF"/>
+              </w:rPr>
+              <w:t xml:space="preserve">Estimated Value</w:t>
+            </w:r>
+          </w:p>
+        </w:tc>
+      </w:tr>
+      <w:tr>
+        <w:tc>
+          <w:tcPr>
+            <w:tcW w:w="3000" w:type="dxa"/>
+            <w:vAlign w:val="center"/>
+          </w:tcPr>
+          <w:p>
+            <w:pPr>
+              <w:jc w:val="center"/>
+              <w:spacing w:before="60" w:after="60" w:line="240" w:lineRule="auto"/>
+            </w:pPr>
+            <w:r>
+              <w:rPr>
+                <w:rFonts w:ascii="Times New Roman" w:hAnsi="Times New Roman" w:cs="Times New Roman"/>
+                <w:sz w:val="22"/>
+                <w:szCs w:val="22"/>
+                <w:color w:val="000000"/>
+              </w:rPr>
+              <w:t xml:space="preserve">Bug Prevention</w:t>
+            </w:r>
+          </w:p>
+        </w:tc>
+        <w:tc>
+          <w:tcPr>
+            <w:tcW w:w="3000" w:type="dxa"/>
+            <w:vAlign w:val="center"/>
+          </w:tcPr>
+          <w:p>
+            <w:pPr>
+              <w:jc w:val="center"/>
+              <w:spacing w:before="60" w:after="60" w:line="240" w:lineRule="auto"/>
+            </w:pPr>
+            <w:r>
+              <w:rPr>
+                <w:rFonts w:ascii="Times New Roman" w:hAnsi="Times New Roman" w:cs="Times New Roman"/>
+                <w:sz w:val="22"/>
+                <w:szCs w:val="22"/>
+                <w:color w:val="000000"/>
+              </w:rPr>
+              <w:t xml:space="preserve">Bugs found pre-silicon</w:t>
+            </w:r>
+          </w:p>
+        </w:tc>
+        <w:tc>
+          <w:tcPr>
+            <w:tcW w:w="3000" w:type="dxa"/>
+            <w:vAlign w:val="center"/>
+          </w:tcPr>
+          <w:p>
+            <w:pPr>
+              <w:jc w:val="center"/>
+              <w:spacing w:before="60" w:after="60" w:line="240" w:lineRule="auto"/>
+            </w:pPr>
+            <w:r>
+              <w:rPr>
+                <w:rFonts w:ascii="Times New Roman" w:hAnsi="Times New Roman" w:cs="Times New Roman"/>
+                <w:sz w:val="22"/>
+                <w:szCs w:val="22"/>
+                <w:color w:val="000000"/>
+              </w:rPr>
+              <w:t xml:space="preserve">3 (Severity 2)</w:t>
+            </w:r>
+          </w:p>
+        </w:tc>
+      </w:tr>
+      <w:tr>
+        <w:tc>
+          <w:tcPr>
+            <w:tcW w:w="3000" w:type="dxa"/>
+            <w:vAlign w:val="center"/>
+          </w:tcPr>
+          <w:p>
+            <w:pPr>
+              <w:jc w:val="center"/>
+              <w:spacing w:before="60" w:after="60" w:line="240" w:lineRule="auto"/>
+            </w:pPr>
+            <w:r>
+              <w:rPr>
+                <w:rFonts w:ascii="Times New Roman" w:hAnsi="Times New Roman" w:cs="Times New Roman"/>
+                <w:sz w:val="22"/>
+                <w:szCs w:val="22"/>
+                <w:color w:val="000000"/>
+              </w:rPr>
+              <w:t xml:space="preserve">Cost Avoidance</w:t>
+            </w:r>
+          </w:p>
+        </w:tc>
+        <w:tc>
+          <w:tcPr>
+            <w:tcW w:w="3000" w:type="dxa"/>
+            <w:vAlign w:val="center"/>
+          </w:tcPr>
+          <w:p>
+            <w:pPr>
+              <w:jc w:val="center"/>
+              <w:spacing w:before="60" w:after="60" w:line="240" w:lineRule="auto"/>
+            </w:pPr>
+            <w:r>
+              <w:rPr>
+                <w:rFonts w:ascii="Times New Roman" w:hAnsi="Times New Roman" w:cs="Times New Roman"/>
+                <w:sz w:val="22"/>
+                <w:szCs w:val="22"/>
+                <w:color w:val="000000"/>
+              </w:rPr>
+              <w:t xml:space="preserve">Estimated re-spin cost saved</w:t>
+            </w:r>
+          </w:p>
+        </w:tc>
+        <w:tc>
+          <w:tcPr>
+            <w:tcW w:w="3000" w:type="dxa"/>
+            <w:vAlign w:val="center"/>
+          </w:tcPr>
+          <w:p>
+            <w:pPr>
+              <w:jc w:val="center"/>
+              <w:spacing w:before="60" w:after="60" w:line="240" w:lineRule="auto"/>
+            </w:pPr>
+            <w:r>
+              <w:rPr>
+                <w:rFonts w:ascii="Times New Roman" w:hAnsi="Times New Roman" w:cs="Times New Roman"/>
+                <w:sz w:val="22"/>
+                <w:szCs w:val="22"/>
+                <w:color w:val="000000"/>
+              </w:rPr>
+              <w:t xml:space="preserve">$3-10 million</w:t>
+            </w:r>
+          </w:p>
+        </w:tc>
+      </w:tr>
+      <w:tr>
+        <w:tc>
+          <w:tcPr>
+            <w:tcW w:w="3000" w:type="dxa"/>
+            <w:vAlign w:val="center"/>
+          </w:tcPr>
+          <w:p>
+            <w:pPr>
+              <w:jc w:val="center"/>
+              <w:spacing w:before="60" w:after="60" w:line="240" w:lineRule="auto"/>
+            </w:pPr>
+            <w:r>
+              <w:rPr>
+                <w:rFonts w:ascii="Times New Roman" w:hAnsi="Times New Roman" w:cs="Times New Roman"/>
+                <w:sz w:val="22"/>
+                <w:szCs w:val="22"/>
+                <w:color w:val="000000"/>
+              </w:rPr>
+              <w:t xml:space="preserve">Reliability</w:t>
+            </w:r>
+          </w:p>
+        </w:tc>
+        <w:tc>
+          <w:tcPr>
+            <w:tcW w:w="3000" w:type="dxa"/>
+            <w:vAlign w:val="center"/>
+          </w:tcPr>
+          <w:p>
+            <w:pPr>
+              <w:jc w:val="center"/>
+              <w:spacing w:before="60" w:after="60" w:line="240" w:lineRule="auto"/>
+            </w:pPr>
+            <w:r>
+              <w:rPr>
+                <w:rFonts w:ascii="Times New Roman" w:hAnsi="Times New Roman" w:cs="Times New Roman"/>
+                <w:sz w:val="22"/>
+                <w:szCs w:val="22"/>
+                <w:color w:val="000000"/>
+              </w:rPr>
+              <w:t xml:space="preserve">Automated checks per regression</w:t>
+            </w:r>
+          </w:p>
+        </w:tc>
+        <w:tc>
+          <w:tcPr>
+            <w:tcW w:w="3000" w:type="dxa"/>
+            <w:vAlign w:val="center"/>
+          </w:tcPr>
+          <w:p>
+            <w:pPr>
+              <w:jc w:val="center"/>
+              <w:spacing w:before="60" w:after="60" w:line="240" w:lineRule="auto"/>
+            </w:pPr>
+            <w:r>
+              <w:rPr>
+                <w:rFonts w:ascii="Times New Roman" w:hAnsi="Times New Roman" w:cs="Times New Roman"/>
+                <w:sz w:val="22"/>
+                <w:szCs w:val="22"/>
+                <w:color w:val="000000"/>
+              </w:rPr>
+              <w:t xml:space="preserve">50,000+</w:t>
+            </w:r>
+          </w:p>
+        </w:tc>
+      </w:tr>
+      <w:tr>
+        <w:tc>
+          <w:tcPr>
+            <w:tcW w:w="3000" w:type="dxa"/>
+            <w:vAlign w:val="center"/>
+          </w:tcPr>
+          <w:p>
+            <w:pPr>
+              <w:jc w:val="center"/>
+              <w:spacing w:before="60" w:after="60" w:line="240" w:lineRule="auto"/>
+            </w:pPr>
+            <w:r>
+              <w:rPr>
+                <w:rFonts w:ascii="Times New Roman" w:hAnsi="Times New Roman" w:cs="Times New Roman"/>
+                <w:sz w:val="22"/>
+                <w:szCs w:val="22"/>
+                <w:color w:val="000000"/>
+              </w:rPr>
+              <w:t xml:space="preserve">Innovation</w:t>
+            </w:r>
+          </w:p>
+        </w:tc>
+        <w:tc>
+          <w:tcPr>
+            <w:tcW w:w="3000" w:type="dxa"/>
+            <w:vAlign w:val="center"/>
+          </w:tcPr>
+          <w:p>
+            <w:pPr>
+              <w:jc w:val="center"/>
+              <w:spacing w:before="60" w:after="60" w:line="240" w:lineRule="auto"/>
+            </w:pPr>
+            <w:r>
+              <w:rPr>
+                <w:rFonts w:ascii="Times New Roman" w:hAnsi="Times New Roman" w:cs="Times New Roman"/>
+                <w:sz w:val="22"/>
+                <w:szCs w:val="22"/>
+                <w:color w:val="000000"/>
+              </w:rPr>
+              <w:t xml:space="preserve">Time reduction via AI agent</w:t>
+            </w:r>
+          </w:p>
+        </w:tc>
+        <w:tc>
+          <w:tcPr>
+            <w:tcW w:w="3000" w:type="dxa"/>
+            <w:vAlign w:val="center"/>
+          </w:tcPr>
+          <w:p>
+            <w:pPr>
+              <w:jc w:val="center"/>
+              <w:spacing w:before="60" w:after="60" w:line="240" w:lineRule="auto"/>
+            </w:pPr>
+            <w:r>
+              <w:rPr>
+                <w:rFonts w:ascii="Times New Roman" w:hAnsi="Times New Roman" w:cs="Times New Roman"/>
+                <w:sz w:val="22"/>
+                <w:szCs w:val="22"/>
+                <w:color w:val="000000"/>
+              </w:rPr>
+              <w:t xml:space="preserve">40x (2-3 days to &lt;1 hour)</w:t>
+            </w:r>
+          </w:p>
+        </w:tc>
+      </w:tr>
+      <w:tr>
+        <w:tc>
+          <w:tcPr>
+            <w:tcW w:w="3000" w:type="dxa"/>
+            <w:vAlign w:val="center"/>
+          </w:tcPr>
+          <w:p>
+            <w:pPr>
+              <w:jc w:val="center"/>
+              <w:spacing w:before="60" w:after="60" w:line="240" w:lineRule="auto"/>
+            </w:pPr>
+            <w:r>
+              <w:rPr>
+                <w:rFonts w:ascii="Times New Roman" w:hAnsi="Times New Roman" w:cs="Times New Roman"/>
+                <w:sz w:val="22"/>
+                <w:szCs w:val="22"/>
+                <w:color w:val="000000"/>
+              </w:rPr>
+              <w:t xml:space="preserve">Energy</w:t>
+            </w:r>
+          </w:p>
+        </w:tc>
+        <w:tc>
+          <w:tcPr>
+            <w:tcW w:w="3000" w:type="dxa"/>
+            <w:vAlign w:val="center"/>
+          </w:tcPr>
+          <w:p>
+            <w:pPr>
+              <w:jc w:val="center"/>
+              <w:spacing w:before="60" w:after="60" w:line="240" w:lineRule="auto"/>
+            </w:pPr>
+            <w:r>
+              <w:rPr>
+                <w:rFonts w:ascii="Times New Roman" w:hAnsi="Times New Roman" w:cs="Times New Roman"/>
+                <w:sz w:val="22"/>
+                <w:szCs w:val="22"/>
+                <w:color w:val="000000"/>
+              </w:rPr>
+              <w:t xml:space="preserve">Power saved via clock gating</w:t>
+            </w:r>
+          </w:p>
+        </w:tc>
+        <w:tc>
+          <w:tcPr>
+            <w:tcW w:w="3000" w:type="dxa"/>
+            <w:vAlign w:val="center"/>
+          </w:tcPr>
+          <w:p>
+            <w:pPr>
+              <w:jc w:val="center"/>
+              <w:spacing w:before="60" w:after="60" w:line="240" w:lineRule="auto"/>
+            </w:pPr>
+            <w:r>
+              <w:rPr>
+                <w:rFonts w:ascii="Times New Roman" w:hAnsi="Times New Roman" w:cs="Times New Roman"/>
+                <w:sz w:val="22"/>
+                <w:szCs w:val="22"/>
+                <w:color w:val="000000"/>
+              </w:rPr>
+              <w:t xml:space="preserve">15-30% dynamic power reduction</w:t>
+            </w:r>
+          </w:p>
+        </w:tc>
+      </w:tr>
+      <w:tr>
+        <w:tc>
+          <w:tcPr>
+            <w:tcW w:w="3000" w:type="dxa"/>
+            <w:vAlign w:val="center"/>
+          </w:tcPr>
+          <w:p>
+            <w:pPr>
+              <w:jc w:val="center"/>
+              <w:spacing w:before="60" w:after="60" w:line="240" w:lineRule="auto"/>
+            </w:pPr>
+            <w:r>
+              <w:rPr>
+                <w:rFonts w:ascii="Times New Roman" w:hAnsi="Times New Roman" w:cs="Times New Roman"/>
+                <w:sz w:val="22"/>
+                <w:szCs w:val="22"/>
+                <w:color w:val="000000"/>
+              </w:rPr>
+              <w:t xml:space="preserve">Productivity</w:t>
+            </w:r>
+          </w:p>
+        </w:tc>
+        <w:tc>
+          <w:tcPr>
+            <w:tcW w:w="3000" w:type="dxa"/>
+            <w:vAlign w:val="center"/>
+          </w:tcPr>
+          <w:p>
+            <w:pPr>
+              <w:jc w:val="center"/>
+              <w:spacing w:before="60" w:after="60" w:line="240" w:lineRule="auto"/>
+            </w:pPr>
+            <w:r>
+              <w:rPr>
+                <w:rFonts w:ascii="Times New Roman" w:hAnsi="Times New Roman" w:cs="Times New Roman"/>
+                <w:sz w:val="22"/>
+                <w:szCs w:val="22"/>
+                <w:color w:val="000000"/>
+              </w:rPr>
+              <w:t xml:space="preserve">Engineer hours saved annually</w:t>
+            </w:r>
+          </w:p>
+        </w:tc>
+        <w:tc>
+          <w:tcPr>
+            <w:tcW w:w="3000" w:type="dxa"/>
+            <w:vAlign w:val="center"/>
+          </w:tcPr>
+          <w:p>
+            <w:pPr>
+              <w:jc w:val="center"/>
+              <w:spacing w:before="60" w:after="60" w:line="240" w:lineRule="auto"/>
+            </w:pPr>
+            <w:r>
+              <w:rPr>
+                <w:rFonts w:ascii="Times New Roman" w:hAnsi="Times New Roman" w:cs="Times New Roman"/>
+                <w:sz w:val="22"/>
+                <w:szCs w:val="22"/>
+                <w:color w:val="000000"/>
+              </w:rPr>
+              <w:t xml:space="preserve">~200 hours</w:t>
+            </w:r>
+          </w:p>
+        </w:tc>
+      </w:tr>
+      <w:tr>
+        <w:tc>
+          <w:tcPr>
+            <w:tcW w:w="3000" w:type="dxa"/>
+            <w:vAlign w:val="center"/>
+          </w:tcPr>
+          <w:p>
+            <w:pPr>
+              <w:jc w:val="center"/>
+              <w:spacing w:before="60" w:after="60" w:line="240" w:lineRule="auto"/>
+            </w:pPr>
+            <w:r>
+              <w:rPr>
+                <w:rFonts w:ascii="Times New Roman" w:hAnsi="Times New Roman" w:cs="Times New Roman"/>
+                <w:sz w:val="22"/>
+                <w:szCs w:val="22"/>
+                <w:color w:val="000000"/>
+              </w:rPr>
+              <w:t xml:space="preserve">Waste Prevention</w:t>
+            </w:r>
+          </w:p>
+        </w:tc>
+        <w:tc>
+          <w:tcPr>
+            <w:tcW w:w="3000" w:type="dxa"/>
+            <w:vAlign w:val="center"/>
+          </w:tcPr>
+          <w:p>
+            <w:pPr>
+              <w:jc w:val="center"/>
+              <w:spacing w:before="60" w:after="60" w:line="240" w:lineRule="auto"/>
+            </w:pPr>
+            <w:r>
+              <w:rPr>
+                <w:rFonts w:ascii="Times New Roman" w:hAnsi="Times New Roman" w:cs="Times New Roman"/>
+                <w:sz w:val="22"/>
+                <w:szCs w:val="22"/>
+                <w:color w:val="000000"/>
+              </w:rPr>
+              <w:t xml:space="preserve">Potential wafer waste avoided</w:t>
+            </w:r>
+          </w:p>
+        </w:tc>
+        <w:tc>
+          <w:tcPr>
+            <w:tcW w:w="3000" w:type="dxa"/>
+            <w:vAlign w:val="center"/>
+          </w:tcPr>
+          <w:p>
+            <w:pPr>
+              <w:jc w:val="center"/>
+              <w:spacing w:before="60" w:after="60" w:line="240" w:lineRule="auto"/>
+            </w:pPr>
+            <w:r>
+              <w:rPr>
+                <w:rFonts w:ascii="Times New Roman" w:hAnsi="Times New Roman" w:cs="Times New Roman"/>
+                <w:sz w:val="22"/>
+                <w:szCs w:val="22"/>
+                <w:color w:val="000000"/>
+              </w:rPr>
+              <w:t xml:space="preserve">~500 wafers per re-spin</w:t>
+            </w:r>
+          </w:p>
+        </w:tc>
+      </w:tr>
+      <w:tr>
+        <w:tc>
+          <w:tcPr>
+            <w:tcW w:w="3000" w:type="dxa"/>
+            <w:vAlign w:val="center"/>
+          </w:tcPr>
+          <w:p>
+            <w:pPr>
+              <w:jc w:val="center"/>
+              <w:spacing w:before="60" w:after="60" w:line="240" w:lineRule="auto"/>
+            </w:pPr>
+            <w:r>
+              <w:rPr>
+                <w:rFonts w:ascii="Times New Roman" w:hAnsi="Times New Roman" w:cs="Times New Roman"/>
+                <w:sz w:val="22"/>
+                <w:szCs w:val="22"/>
+                <w:color w:val="000000"/>
+              </w:rPr>
+              <w:t xml:space="preserve">Downstream Impact</w:t>
+            </w:r>
+          </w:p>
+        </w:tc>
+        <w:tc>
+          <w:tcPr>
+            <w:tcW w:w="3000" w:type="dxa"/>
+            <w:vAlign w:val="center"/>
+          </w:tcPr>
+          <w:p>
+            <w:pPr>
+              <w:jc w:val="center"/>
+              <w:spacing w:before="60" w:after="60" w:line="240" w:lineRule="auto"/>
+            </w:pPr>
+            <w:r>
+              <w:rPr>
+                <w:rFonts w:ascii="Times New Roman" w:hAnsi="Times New Roman" w:cs="Times New Roman"/>
+                <w:sz w:val="22"/>
+                <w:szCs w:val="22"/>
+                <w:color w:val="000000"/>
+              </w:rPr>
+              <w:t xml:space="preserve">Devices using verified silicon</w:t>
+            </w:r>
+          </w:p>
+        </w:tc>
+        <w:tc>
+          <w:tcPr>
+            <w:tcW w:w="3000" w:type="dxa"/>
+            <w:vAlign w:val="center"/>
+          </w:tcPr>
+          <w:p>
+            <w:pPr>
+              <w:jc w:val="center"/>
+              <w:spacing w:before="60" w:after="60" w:line="240" w:lineRule="auto"/>
+            </w:pPr>
+            <w:r>
+              <w:rPr>
+                <w:rFonts w:ascii="Times New Roman" w:hAnsi="Times New Roman" w:cs="Times New Roman"/>
+                <w:sz w:val="22"/>
+                <w:szCs w:val="22"/>
+                <w:color w:val="000000"/>
+              </w:rPr>
+              <w:t xml:space="preserve">Billions annually</w:t>
+            </w:r>
+          </w:p>
+        </w:tc>
+      </w:tr>
+    </w:tbl>
+    <w:p>
+      <w:pPr>
+        <w:spacing w:before="0" w:after="0" w:line="360" w:lineRule="auto"/>
+      </w:pPr>
+    </w:p>
+    <w:p>
+      <w:pPr>
+        <w:pStyle w:val="Heading2"/>
+        <w:jc w:val="left"/>
+        <w:spacing w:before="240" w:after="120" w:line="360" w:lineRule="auto"/>
+      </w:pPr>
+      <w:r>
+        <w:rPr>
+          <w:rFonts w:ascii="Calibri" w:hAnsi="Calibri" w:cs="Calibri"/>
+          <w:sz w:val="28"/>
+          <w:szCs w:val="28"/>
+          <w:b/>
+          <w:bCs/>
+          <w:color w:val="1F4E79"/>
+        </w:rPr>
+        <w:t xml:space="preserve">10.5 Broader Sustainability Implications</w:t>
+      </w:r>
+    </w:p>
+    <w:p>
+      <w:pPr>
+        <w:jc w:val="both"/>
+        <w:spacing w:before="0" w:after="120" w:line="360" w:lineRule="auto"/>
+      </w:pPr>
+      <w:r>
+        <w:rPr>
+          <w:rFonts w:ascii="Times New Roman" w:hAnsi="Times New Roman" w:cs="Times New Roman"/>
+          <w:sz w:val="24"/>
+          <w:szCs w:val="24"/>
+        </w:rPr>
+        <w:t xml:space="preserve">The semiconductor industry is foundational to virtually all other industries' sustainability efforts -- from smart grids optimising energy distribution, to precision agriculture reducing resource usage, to telemedicine reducing transportation emissions. Ensuring the reliability of the silicon that powers these systems is therefore a force multiplier for sustainability across all sectors.</w:t>
+      </w:r>
+    </w:p>
+    <w:p>
+      <w:pPr>
+        <w:spacing w:before="0" w:after="0" w:line="360" w:lineRule="auto"/>
+      </w:pPr>
+    </w:p>
+    <w:p>
+      <w:pPr>
+        <w:jc w:val="both"/>
+        <w:spacing w:before="0" w:after="120" w:line="360" w:lineRule="auto"/>
+      </w:pPr>
+      <w:r>
+        <w:rPr>
+          <w:rFonts w:ascii="Times New Roman" w:hAnsi="Times New Roman" w:cs="Times New Roman"/>
+          <w:sz w:val="24"/>
+          <w:szCs w:val="24"/>
+        </w:rPr>
+        <w:t xml:space="preserve">Key sustainability implications of this work include:</w:t>
+      </w:r>
+    </w:p>
+    <w:p>
+      <w:pPr>
+        <w:numPr>
+          <w:ilvl w:val="0"/>
+          <w:numId w:val="1"/>
+        </w:numPr>
+        <w:jc w:val="left"/>
+        <w:spacing w:before="0" w:after="120" w:line="360" w:lineRule="auto"/>
+        <w:ind w:left="720"/>
+      </w:pPr>
+      <w:r>
+        <w:rPr>
+          <w:rFonts w:ascii="Times New Roman" w:hAnsi="Times New Roman" w:cs="Times New Roman"/>
+          <w:sz w:val="24"/>
+          <w:szCs w:val="24"/>
+        </w:rPr>
+        <w:t xml:space="preserve">Reliable processors underpin the digital services that 8 billion+ people use daily, from healthcare to education to communication</w:t>
+      </w:r>
+    </w:p>
+    <w:p>
+      <w:pPr>
+        <w:numPr>
+          <w:ilvl w:val="0"/>
+          <w:numId w:val="1"/>
+        </w:numPr>
+        <w:jc w:val="left"/>
+        <w:spacing w:before="0" w:after="120" w:line="360" w:lineRule="auto"/>
+        <w:ind w:left="720"/>
+      </w:pPr>
+      <w:r>
+        <w:rPr>
+          <w:rFonts w:ascii="Times New Roman" w:hAnsi="Times New Roman" w:cs="Times New Roman"/>
+          <w:sz w:val="24"/>
+          <w:szCs w:val="24"/>
+        </w:rPr>
+        <w:t xml:space="preserve">Engineers shipping verified, bug-free IP means downstream chip vendors can integrate reliable processor IP without re-discovering bugs, avoiding duplicated verification effort across the industry</w:t>
+      </w:r>
+    </w:p>
+    <w:p>
+      <w:pPr>
+        <w:numPr>
+          <w:ilvl w:val="0"/>
+          <w:numId w:val="1"/>
+        </w:numPr>
+        <w:jc w:val="left"/>
+        <w:spacing w:before="0" w:after="120" w:line="360" w:lineRule="auto"/>
+        <w:ind w:left="720"/>
+      </w:pPr>
+      <w:r>
+        <w:rPr>
+          <w:rFonts w:ascii="Times New Roman" w:hAnsi="Times New Roman" w:cs="Times New Roman"/>
+          <w:sz w:val="24"/>
+          <w:szCs w:val="24"/>
+        </w:rPr>
+        <w:t xml:space="preserve">End users -- billions of phones, medical devices, vehicles, and data centre servers -- run on silicon validated by processes like those developed in this internship</w:t>
+      </w:r>
+    </w:p>
+    <w:p>
+      <w:pPr>
+        <w:numPr>
+          <w:ilvl w:val="0"/>
+          <w:numId w:val="1"/>
+        </w:numPr>
+        <w:jc w:val="left"/>
+        <w:spacing w:before="0" w:after="120" w:line="360" w:lineRule="auto"/>
+        <w:ind w:left="720"/>
+      </w:pPr>
+      <w:r>
+        <w:rPr>
+          <w:rFonts w:ascii="Times New Roman" w:hAnsi="Times New Roman" w:cs="Times New Roman"/>
+          <w:sz w:val="24"/>
+          <w:szCs w:val="24"/>
+        </w:rPr>
+        <w:t xml:space="preserve">The AI-assisted workflow reduces the carbon footprint of the engineering process itself by requiring fewer computation cycles for manual iteration</w:t>
+      </w:r>
+    </w:p>
+    <w:p>
+      <w:pPr>
+        <w:spacing w:before="0" w:after="0" w:line="360" w:lineRule="auto"/>
+      </w:pPr>
+    </w:p>
+    <w:p>
+      <w:pPr>
+        <w:pStyle w:val="Heading2"/>
+        <w:jc w:val="left"/>
+        <w:spacing w:before="240" w:after="120" w:line="360" w:lineRule="auto"/>
+      </w:pPr>
+      <w:r>
+        <w:rPr>
+          <w:rFonts w:ascii="Calibri" w:hAnsi="Calibri" w:cs="Calibri"/>
+          <w:sz w:val="28"/>
+          <w:szCs w:val="28"/>
+          <w:b/>
+          <w:bCs/>
+          <w:color w:val="1F4E79"/>
+        </w:rPr>
+        <w:t xml:space="preserve">10.6 Future Sustainability Opportunities</w:t>
+      </w:r>
+    </w:p>
+    <w:p>
+      <w:pPr>
+        <w:jc w:val="both"/>
+        <w:spacing w:before="0" w:after="120" w:line="360" w:lineRule="auto"/>
+      </w:pPr>
+      <w:r>
+        <w:rPr>
+          <w:rFonts w:ascii="Times New Roman" w:hAnsi="Times New Roman" w:cs="Times New Roman"/>
+          <w:sz w:val="24"/>
+          <w:szCs w:val="24"/>
+        </w:rPr>
+        <w:t xml:space="preserve">Looking forward, several opportunities exist to further enhance the sustainability impact of SoC verification work:</w:t>
+      </w:r>
+    </w:p>
+    <w:p>
+      <w:pPr>
+        <w:numPr>
+          <w:ilvl w:val="0"/>
+          <w:numId w:val="1"/>
+        </w:numPr>
+        <w:jc w:val="left"/>
+        <w:spacing w:before="0" w:after="120" w:line="360" w:lineRule="auto"/>
+        <w:ind w:left="720"/>
+      </w:pPr>
+      <w:r>
+        <w:rPr>
+          <w:rFonts w:ascii="Times New Roman" w:hAnsi="Times New Roman" w:cs="Times New Roman"/>
+          <w:sz w:val="24"/>
+          <w:szCs w:val="24"/>
+        </w:rPr>
+        <w:t xml:space="preserve">Developing energy-aware regression scheduling that optimises compute farm utilisation and reduces idle power consumption during verification runs</w:t>
+      </w:r>
+    </w:p>
+    <w:p>
+      <w:pPr>
+        <w:numPr>
+          <w:ilvl w:val="0"/>
+          <w:numId w:val="1"/>
+        </w:numPr>
+        <w:jc w:val="left"/>
+        <w:spacing w:before="0" w:after="120" w:line="360" w:lineRule="auto"/>
+        <w:ind w:left="720"/>
+      </w:pPr>
+      <w:r>
+        <w:rPr>
+          <w:rFonts w:ascii="Times New Roman" w:hAnsi="Times New Roman" w:cs="Times New Roman"/>
+          <w:sz w:val="24"/>
+          <w:szCs w:val="24"/>
+        </w:rPr>
+        <w:t xml:space="preserve">Extending the AI agent to reduce the total number of simulation cycles needed for coverage closure, directly reducing compute energy</w:t>
+      </w:r>
+    </w:p>
+    <w:p>
+      <w:pPr>
+        <w:numPr>
+          <w:ilvl w:val="0"/>
+          <w:numId w:val="1"/>
+        </w:numPr>
+        <w:jc w:val="left"/>
+        <w:spacing w:before="0" w:after="120" w:line="360" w:lineRule="auto"/>
+        <w:ind w:left="720"/>
+      </w:pPr>
+      <w:r>
+        <w:rPr>
+          <w:rFonts w:ascii="Times New Roman" w:hAnsi="Times New Roman" w:cs="Times New Roman"/>
+          <w:sz w:val="24"/>
+          <w:szCs w:val="24"/>
+        </w:rPr>
+        <w:t xml:space="preserve">Creating formal verification flows that mathematically prove correctness properties, potentially eliminating the need for millions of simulation cycles</w:t>
+      </w:r>
+    </w:p>
+    <w:p>
+      <w:pPr>
+        <w:numPr>
+          <w:ilvl w:val="0"/>
+          <w:numId w:val="1"/>
+        </w:numPr>
+        <w:jc w:val="left"/>
+        <w:spacing w:before="0" w:after="120" w:line="360" w:lineRule="auto"/>
+        <w:ind w:left="720"/>
+      </w:pPr>
+      <w:r>
+        <w:rPr>
+          <w:rFonts w:ascii="Times New Roman" w:hAnsi="Times New Roman" w:cs="Times New Roman"/>
+          <w:sz w:val="24"/>
+          <w:szCs w:val="24"/>
+        </w:rPr>
+        <w:t xml:space="preserve">Investigating approximate computing verification techniques that enable power-efficient hardware designs for sustainability applications</w:t>
+      </w:r>
+    </w:p>
+    <w:p>
+      <w:pPr>
+        <w:spacing w:before="0" w:after="0" w:line="360" w:lineRule="auto"/>
+      </w:pPr>
+    </w:p>
+    <w:p>
+      <w:pPr>
+        <w:jc w:val="both"/>
+        <w:spacing w:before="0" w:after="120" w:line="360" w:lineRule="auto"/>
+      </w:pPr>
+      <w:r>
+        <w:rPr>
+          <w:rFonts w:ascii="Times New Roman" w:hAnsi="Times New Roman" w:cs="Times New Roman"/>
+          <w:sz w:val="24"/>
+          <w:szCs w:val="24"/>
+        </w:rPr>
+        <w:t xml:space="preserve">In conclusion, while the primary objective of SoC verification is functional correctness, the broader impact -- preventing waste, enabling energy efficiency, accelerating innovation, and ensuring the reliability of infrastructure that billions depend on -- aligns directly with the UN Sustainable Development Goals and contributes to a more sustainable technology ecosystem.</w:t>
       </w:r>
     </w:p>
     <w:p>

</xml_diff>

<commit_message>
Fix TOC page numbers to match actual document layout
</commit_message>
<xml_diff>
--- a/Final-Report-102206005.docx
+++ b/Final-Report-102206005.docx
@@ -1387,7 +1387,7 @@
           <w:sz w:val="24"/>
           <w:szCs w:val="24"/>
         </w:rPr>
-        <w:t xml:space="preserve">   2.2 AMBA Protocol Family ................................ 5</w:t>
+        <w:t xml:space="preserve">   2.2 AMBA Protocol Family ................................ 6</w:t>
       </w:r>
     </w:p>
     <w:p>
@@ -1401,7 +1401,7 @@
           <w:sz w:val="24"/>
           <w:szCs w:val="24"/>
         </w:rPr>
-        <w:t xml:space="preserve">   2.3 UVM Verification Methodology ........................ 7</w:t>
+        <w:t xml:space="preserve">   2.3 UVM Verification Methodology ........................ 8</w:t>
       </w:r>
     </w:p>
     <w:p>
@@ -1415,7 +1415,7 @@
           <w:sz w:val="24"/>
           <w:szCs w:val="24"/>
         </w:rPr>
-        <w:t xml:space="preserve">   2.4 Coherent Mesh Network Architecture .................. 9</w:t>
+        <w:t xml:space="preserve">   2.4 Coherent Mesh Network Architecture ................. 10</w:t>
       </w:r>
     </w:p>
     <w:p>
@@ -1429,7 +1429,7 @@
           <w:sz w:val="24"/>
           <w:szCs w:val="24"/>
         </w:rPr>
-        <w:t xml:space="preserve">Chapter 3: Internship Details ............................. 11</w:t>
+        <w:t xml:space="preserve">Chapter 3: Internship Details ............................. 12</w:t>
       </w:r>
     </w:p>
     <w:p>
@@ -1443,7 +1443,7 @@
           <w:sz w:val="24"/>
           <w:szCs w:val="24"/>
         </w:rPr>
-        <w:t xml:space="preserve">   3.1 Organisation Structure ............................. 11</w:t>
+        <w:t xml:space="preserve">   3.1 Organisation Structure ............................. 12</w:t>
       </w:r>
     </w:p>
     <w:p>
@@ -1457,7 +1457,7 @@
           <w:sz w:val="24"/>
           <w:szCs w:val="24"/>
         </w:rPr>
-        <w:t xml:space="preserve">   3.2 Timeline and Milestones ............................ 12</w:t>
+        <w:t xml:space="preserve">   3.2 Timeline and Milestones ............................ 13</w:t>
       </w:r>
     </w:p>
     <w:p>
@@ -1471,7 +1471,7 @@
           <w:sz w:val="24"/>
           <w:szCs w:val="24"/>
         </w:rPr>
-        <w:t xml:space="preserve">   3.3 Tools and Technologies ............................. 12</w:t>
+        <w:t xml:space="preserve">   3.3 Tools and Technologies ............................. 13</w:t>
       </w:r>
     </w:p>
     <w:p>
@@ -1485,7 +1485,7 @@
           <w:sz w:val="24"/>
           <w:szCs w:val="24"/>
         </w:rPr>
-        <w:t xml:space="preserve">Chapter 4: Status Register Checker ........................ 13</w:t>
+        <w:t xml:space="preserve">Chapter 4: Status Register Checker ........................ 14</w:t>
       </w:r>
     </w:p>
     <w:p>
@@ -1499,7 +1499,7 @@
           <w:sz w:val="24"/>
           <w:szCs w:val="24"/>
         </w:rPr>
-        <w:t xml:space="preserve">   4.1 Problem Statement .................................. 13</w:t>
+        <w:t xml:space="preserve">   4.1 Problem Statement .................................. 14</w:t>
       </w:r>
     </w:p>
     <w:p>
@@ -1513,7 +1513,7 @@
           <w:sz w:val="24"/>
           <w:szCs w:val="24"/>
         </w:rPr>
-        <w:t xml:space="preserve">   4.2 Architecture Design ................................ 14</w:t>
+        <w:t xml:space="preserve">   4.2 Architecture Design ................................ 15</w:t>
       </w:r>
     </w:p>
     <w:p>
@@ -1527,7 +1527,7 @@
           <w:sz w:val="24"/>
           <w:szCs w:val="24"/>
         </w:rPr>
-        <w:t xml:space="preserve">   4.3 Python Log Parser .................................. 15</w:t>
+        <w:t xml:space="preserve">   4.3 Python Log Parser .................................. 16</w:t>
       </w:r>
     </w:p>
     <w:p>
@@ -1541,7 +1541,7 @@
           <w:sz w:val="24"/>
           <w:szCs w:val="24"/>
         </w:rPr>
-        <w:t xml:space="preserve">   4.4 UVM Scoreboard Design .............................. 16</w:t>
+        <w:t xml:space="preserve">   4.4 UVM Scoreboard Design .............................. 17</w:t>
       </w:r>
     </w:p>
     <w:p>
@@ -1555,7 +1555,7 @@
           <w:sz w:val="24"/>
           <w:szCs w:val="24"/>
         </w:rPr>
-        <w:t xml:space="preserve">   4.5 Timestamp Synchronisation .......................... 17</w:t>
+        <w:t xml:space="preserve">   4.5 Timestamp Synchronisation .......................... 18</w:t>
       </w:r>
     </w:p>
     <w:p>
@@ -1569,7 +1569,7 @@
           <w:sz w:val="24"/>
           <w:szCs w:val="24"/>
         </w:rPr>
-        <w:t xml:space="preserve">   4.6 Results and Bug Discovery .......................... 18</w:t>
+        <w:t xml:space="preserve">   4.6 Results and Bug Discovery .......................... 19</w:t>
       </w:r>
     </w:p>
     <w:p>
@@ -1583,7 +1583,7 @@
           <w:sz w:val="24"/>
           <w:szCs w:val="24"/>
         </w:rPr>
-        <w:t xml:space="preserve">Chapter 5: Compile Warning Resolution ..................... 19</w:t>
+        <w:t xml:space="preserve">Chapter 5: Compile Warning Resolution ..................... 20</w:t>
       </w:r>
     </w:p>
     <w:p>
@@ -1597,7 +1597,7 @@
           <w:sz w:val="24"/>
           <w:szCs w:val="24"/>
         </w:rPr>
-        <w:t xml:space="preserve">   5.1 Warning Analysis ................................... 19</w:t>
+        <w:t xml:space="preserve">   5.1 Warning Analysis ................................... 20</w:t>
       </w:r>
     </w:p>
     <w:p>
@@ -1611,7 +1611,7 @@
           <w:sz w:val="24"/>
           <w:szCs w:val="24"/>
         </w:rPr>
-        <w:t xml:space="preserve">   5.2 Classification and Distribution .................... 20</w:t>
+        <w:t xml:space="preserve">   5.2 Classification and Distribution .................... 21</w:t>
       </w:r>
     </w:p>
     <w:p>
@@ -1625,7 +1625,7 @@
           <w:sz w:val="24"/>
           <w:szCs w:val="24"/>
         </w:rPr>
-        <w:t xml:space="preserve">   5.3 Resolution Methodology ............................. 21</w:t>
+        <w:t xml:space="preserve">   5.3 Resolution Methodology ............................. 22</w:t>
       </w:r>
     </w:p>
     <w:p>
@@ -1639,7 +1639,7 @@
           <w:sz w:val="24"/>
           <w:szCs w:val="24"/>
         </w:rPr>
-        <w:t xml:space="preserve">   5.4 Case Studies ....................................... 22</w:t>
+        <w:t xml:space="preserve">   5.4 Case Studies ....................................... 23</w:t>
       </w:r>
     </w:p>
     <w:p>
@@ -1653,7 +1653,7 @@
           <w:sz w:val="24"/>
           <w:szCs w:val="24"/>
         </w:rPr>
-        <w:t xml:space="preserve">   5.5 Regression Incident ................................ 23</w:t>
+        <w:t xml:space="preserve">   5.5 Regression Incident ................................ 24</w:t>
       </w:r>
     </w:p>
     <w:p>
@@ -1667,7 +1667,7 @@
           <w:sz w:val="24"/>
           <w:szCs w:val="24"/>
         </w:rPr>
-        <w:t xml:space="preserve">Chapter 6: CMN Clock Controller Integration ............... 24</w:t>
+        <w:t xml:space="preserve">Chapter 6: CMN Clock Controller Integration ............... 25</w:t>
       </w:r>
     </w:p>
     <w:p>
@@ -1681,7 +1681,7 @@
           <w:sz w:val="24"/>
           <w:szCs w:val="24"/>
         </w:rPr>
-        <w:t xml:space="preserve">   6.1 Clock Controller Architecture ...................... 24</w:t>
+        <w:t xml:space="preserve">   6.1 Clock Controller Architecture ...................... 25</w:t>
       </w:r>
     </w:p>
     <w:p>
@@ -1695,7 +1695,7 @@
           <w:sz w:val="24"/>
           <w:szCs w:val="24"/>
         </w:rPr>
-        <w:t xml:space="preserve">   6.2 State Machine Design ............................... 25</w:t>
+        <w:t xml:space="preserve">   6.2 State Machine Design ............................... 26</w:t>
       </w:r>
     </w:p>
     <w:p>
@@ -1709,7 +1709,7 @@
           <w:sz w:val="24"/>
           <w:szCs w:val="24"/>
         </w:rPr>
-        <w:t xml:space="preserve">   6.3 CDC Verification ................................... 27</w:t>
+        <w:t xml:space="preserve">   6.3 CDC Verification ................................... 28</w:t>
       </w:r>
     </w:p>
     <w:p>
@@ -1723,7 +1723,7 @@
           <w:sz w:val="24"/>
           <w:szCs w:val="24"/>
         </w:rPr>
-        <w:t xml:space="preserve">   6.4 Q-Channel Interface ................................ 28</w:t>
+        <w:t xml:space="preserve">   6.4 Q-Channel Interface ................................ 29</w:t>
       </w:r>
     </w:p>
     <w:p>
@@ -1737,7 +1737,7 @@
           <w:sz w:val="24"/>
           <w:szCs w:val="24"/>
         </w:rPr>
-        <w:t xml:space="preserve">   6.5 Bug Discoveries .................................... 29</w:t>
+        <w:t xml:space="preserve">   6.5 Bug Discoveries .................................... 30</w:t>
       </w:r>
     </w:p>
     <w:p>
@@ -1751,7 +1751,7 @@
           <w:sz w:val="24"/>
           <w:szCs w:val="24"/>
         </w:rPr>
-        <w:t xml:space="preserve">Chapter 7: AI Agent for HW Code Generation ................ 30</w:t>
+        <w:t xml:space="preserve">Chapter 7: AI Agent for HW Code Generation ................ 31</w:t>
       </w:r>
     </w:p>
     <w:p>
@@ -1765,7 +1765,7 @@
           <w:sz w:val="24"/>
           <w:szCs w:val="24"/>
         </w:rPr>
-        <w:t xml:space="preserve">   7.1 Motivation and Problem Statement ................... 30</w:t>
+        <w:t xml:space="preserve">   7.1 Motivation and Problem Statement ................... 31</w:t>
       </w:r>
     </w:p>
     <w:p>
@@ -1779,7 +1779,7 @@
           <w:sz w:val="24"/>
           <w:szCs w:val="24"/>
         </w:rPr>
-        <w:t xml:space="preserve">   7.2 System Architecture ................................ 31</w:t>
+        <w:t xml:space="preserve">   7.2 System Architecture ................................ 32</w:t>
       </w:r>
     </w:p>
     <w:p>
@@ -1793,7 +1793,7 @@
           <w:sz w:val="24"/>
           <w:szCs w:val="24"/>
         </w:rPr>
-        <w:t xml:space="preserve">   7.3 RTL Parsing Pipeline ............................... 32</w:t>
+        <w:t xml:space="preserve">   7.3 RTL Parsing Pipeline ............................... 33</w:t>
       </w:r>
     </w:p>
     <w:p>
@@ -1807,7 +1807,7 @@
           <w:sz w:val="24"/>
           <w:szCs w:val="24"/>
         </w:rPr>
-        <w:t xml:space="preserve">   7.4 LLM Integration and RAG ............................ 33</w:t>
+        <w:t xml:space="preserve">   7.4 LLM Integration and RAG ............................ 34</w:t>
       </w:r>
     </w:p>
     <w:p>
@@ -1821,7 +1821,7 @@
           <w:sz w:val="24"/>
           <w:szCs w:val="24"/>
         </w:rPr>
-        <w:t xml:space="preserve">   7.5 CI/CD Pipeline Integration ......................... 34</w:t>
+        <w:t xml:space="preserve">   7.5 CI/CD Pipeline Integration ......................... 35</w:t>
       </w:r>
     </w:p>
     <w:p>
@@ -1835,7 +1835,7 @@
           <w:sz w:val="24"/>
           <w:szCs w:val="24"/>
         </w:rPr>
-        <w:t xml:space="preserve">   7.6 Results and Validation ............................. 35</w:t>
+        <w:t xml:space="preserve">   7.6 Results and Validation ............................. 36</w:t>
       </w:r>
     </w:p>
     <w:p>
@@ -1849,7 +1849,7 @@
           <w:sz w:val="24"/>
           <w:szCs w:val="24"/>
         </w:rPr>
-        <w:t xml:space="preserve">Chapter 8: Results and Discussion ......................... 36</w:t>
+        <w:t xml:space="preserve">Chapter 8: Results and Discussion ......................... 37</w:t>
       </w:r>
     </w:p>
     <w:p>
@@ -1863,7 +1863,7 @@
           <w:sz w:val="24"/>
           <w:szCs w:val="24"/>
         </w:rPr>
-        <w:t xml:space="preserve">   8.1 Summary of Achievements ............................ 36</w:t>
+        <w:t xml:space="preserve">   8.1 Summary of Achievements ............................ 37</w:t>
       </w:r>
     </w:p>
     <w:p>
@@ -1877,7 +1877,7 @@
           <w:sz w:val="24"/>
           <w:szCs w:val="24"/>
         </w:rPr>
-        <w:t xml:space="preserve">   8.2 Impact Assessment .................................. 37</w:t>
+        <w:t xml:space="preserve">   8.2 Impact Assessment .................................. 38</w:t>
       </w:r>
     </w:p>
     <w:p>
@@ -1891,7 +1891,7 @@
           <w:sz w:val="24"/>
           <w:szCs w:val="24"/>
         </w:rPr>
-        <w:t xml:space="preserve">   8.3 Challenges Faced ................................... 38</w:t>
+        <w:t xml:space="preserve">   8.3 Challenges Faced ................................... 39</w:t>
       </w:r>
     </w:p>
     <w:p>
@@ -1905,7 +1905,7 @@
           <w:sz w:val="24"/>
           <w:szCs w:val="24"/>
         </w:rPr>
-        <w:t xml:space="preserve">Chapter 9: Conclusion and Future Scope .................... 39</w:t>
+        <w:t xml:space="preserve">Chapter 9: Conclusion and Future Scope .................... 40</w:t>
       </w:r>
     </w:p>
     <w:p>
@@ -1919,7 +1919,7 @@
           <w:sz w:val="24"/>
           <w:szCs w:val="24"/>
         </w:rPr>
-        <w:t xml:space="preserve">   9.1 Conclusion ......................................... 39</w:t>
+        <w:t xml:space="preserve">   9.1 Conclusion ......................................... 40</w:t>
       </w:r>
     </w:p>
     <w:p>
@@ -1933,7 +1933,7 @@
           <w:sz w:val="24"/>
           <w:szCs w:val="24"/>
         </w:rPr>
-        <w:t xml:space="preserve">   9.2 Future Scope ....................................... 40</w:t>
+        <w:t xml:space="preserve">   9.2 Future Scope ....................................... 41</w:t>
       </w:r>
     </w:p>
     <w:p>
@@ -1947,7 +1947,7 @@
           <w:sz w:val="24"/>
           <w:szCs w:val="24"/>
         </w:rPr>
-        <w:t xml:space="preserve">Chapter 10: Impact Analysis - SDGs ........................ 41</w:t>
+        <w:t xml:space="preserve">Chapter 10: Impact Analysis - SDGs ........................ 42</w:t>
       </w:r>
     </w:p>
     <w:p>
@@ -1961,7 +1961,7 @@
           <w:sz w:val="24"/>
           <w:szCs w:val="24"/>
         </w:rPr>
-        <w:t xml:space="preserve">   10.1 Alignment with UN SDGs ............................ 41</w:t>
+        <w:t xml:space="preserve">   10.1 Alignment with UN SDGs ............................ 42</w:t>
       </w:r>
     </w:p>
     <w:p>
@@ -1975,7 +1975,7 @@
           <w:sz w:val="24"/>
           <w:szCs w:val="24"/>
         </w:rPr>
-        <w:t xml:space="preserve">   10.2 SDG 9: Industry, Innovation ....................... 42</w:t>
+        <w:t xml:space="preserve">   10.2 SDG 9: Industry, Innovation ....................... 43</w:t>
       </w:r>
     </w:p>
     <w:p>
@@ -1989,7 +1989,7 @@
           <w:sz w:val="24"/>
           <w:szCs w:val="24"/>
         </w:rPr>
-        <w:t xml:space="preserve">   10.3 SDG 12: Responsible Production .................... 43</w:t>
+        <w:t xml:space="preserve">   10.3 SDG 12: Responsible Production .................... 44</w:t>
       </w:r>
     </w:p>
     <w:p>
@@ -2003,7 +2003,7 @@
           <w:sz w:val="24"/>
           <w:szCs w:val="24"/>
         </w:rPr>
-        <w:t xml:space="preserve">   10.4 Quantitative Impact ............................... 44</w:t>
+        <w:t xml:space="preserve">   10.4 Quantitative Impact ............................... 45</w:t>
       </w:r>
     </w:p>
     <w:p>
@@ -2017,7 +2017,63 @@
           <w:sz w:val="24"/>
           <w:szCs w:val="24"/>
         </w:rPr>
-        <w:t xml:space="preserve">References ................................................ 45</w:t>
+        <w:t xml:space="preserve">   10.5 Broader Sustainability Implications ............... 45</w:t>
+      </w:r>
+    </w:p>
+    <w:p>
+      <w:pPr>
+        <w:jc w:val="left"/>
+        <w:spacing w:before="0" w:after="40" w:line="360" w:lineRule="auto"/>
+      </w:pPr>
+      <w:r>
+        <w:rPr>
+          <w:rFonts w:ascii="Times New Roman" w:hAnsi="Times New Roman" w:cs="Times New Roman"/>
+          <w:sz w:val="24"/>
+          <w:szCs w:val="24"/>
+        </w:rPr>
+        <w:t xml:space="preserve">   10.6 Future Sustainability Opportunities ............... 46</w:t>
+      </w:r>
+    </w:p>
+    <w:p>
+      <w:pPr>
+        <w:jc w:val="left"/>
+        <w:spacing w:before="0" w:after="40" w:line="360" w:lineRule="auto"/>
+      </w:pPr>
+      <w:r>
+        <w:rPr>
+          <w:rFonts w:ascii="Times New Roman" w:hAnsi="Times New Roman" w:cs="Times New Roman"/>
+          <w:sz w:val="24"/>
+          <w:szCs w:val="24"/>
+        </w:rPr>
+        <w:t xml:space="preserve">References ................................................ 47</w:t>
+      </w:r>
+    </w:p>
+    <w:p>
+      <w:pPr>
+        <w:jc w:val="left"/>
+        <w:spacing w:before="0" w:after="40" w:line="360" w:lineRule="auto"/>
+      </w:pPr>
+      <w:r>
+        <w:rPr>
+          <w:rFonts w:ascii="Times New Roman" w:hAnsi="Times New Roman" w:cs="Times New Roman"/>
+          <w:sz w:val="24"/>
+          <w:szCs w:val="24"/>
+        </w:rPr>
+        <w:t xml:space="preserve">Appendix A: Verification Methodology ...................... 49</w:t>
+      </w:r>
+    </w:p>
+    <w:p>
+      <w:pPr>
+        <w:jc w:val="left"/>
+        <w:spacing w:before="0" w:after="40" w:line="360" w:lineRule="auto"/>
+      </w:pPr>
+      <w:r>
+        <w:rPr>
+          <w:rFonts w:ascii="Times New Roman" w:hAnsi="Times New Roman" w:cs="Times New Roman"/>
+          <w:sz w:val="24"/>
+          <w:szCs w:val="24"/>
+        </w:rPr>
+        <w:t xml:space="preserve">Appendix B: Technical Specifications ...................... 52</w:t>
       </w:r>
     </w:p>
     <w:p>

</xml_diff>